<commit_message>
Typeset Evidence Room SKU books and thicken Monday-ready Office files.
Replace cover-stub PDFs with full Diagnostic, Starter, 217-page Professional OS, Team, Blueprint, and legal-draft books. Expand Word templates, workshop/CFO decks, and example workbooks so a purchaser can start Wave 1 without living in Markdown.

Co-authored-by: adamaziz91 <adamaziz91@gmail.com>
</commit_message>
<xml_diff>
--- a/evidence-room/03_AP_AGENT_OS_PRO/Word_Templates/ER_Governance_Standard.docx
+++ b/evidence-room/03_AP_AGENT_OS_PRO/Word_Templates/ER_Governance_Standard.docx
@@ -5,31 +5,1538 @@
     <w:p>
       <w:r>
         <w:rPr>
-          <w:b/>
+          <w:rFonts w:ascii="Georgia" w:hAnsi="Georgia" w:eastAsia="Georgia"/>
+          <w:b w:val="0"/>
           <w:color w:val="12160F"/>
           <w:sz w:val="44"/>
         </w:rPr>
-        <w:t>Governance standard (working draft)</w:t>
+        <w:t>Governance standard (draft)</w:t>
       </w:r>
     </w:p>
     <w:p>
       <w:r>
-        <w:t>Human accountability, SoD, least privilege, output validation, version control, incident response. Not a certificate. NIST AI RMF and ISO/IEC 42001 are frameworks to consider.</w:t>
+        <w:rPr>
+          <w:rFonts w:ascii="Calibri" w:hAnsi="Calibri" w:eastAsia="Calibri"/>
+          <w:b w:val="0"/>
+          <w:color w:val="5A6154"/>
+          <w:sz w:val="20"/>
+        </w:rPr>
+        <w:t>Blank fields are for the licensee. Northline examples are fictional.</w:t>
+      </w:r>
+    </w:p>
+    <w:p>
+      <w:pPr>
+        <w:pStyle w:val="Heading1"/>
+      </w:pPr>
+      <w:r>
+        <w:rPr>
+          <w:color w:val="12160F"/>
+        </w:rPr>
+        <w:t>Governance Standard</w:t>
       </w:r>
     </w:p>
     <w:p>
       <w:r>
-        <w:t>Brand idea: Proof before permission.</w:t>
+        <w:rPr>
+          <w:rFonts w:ascii="Calibri" w:hAnsi="Calibri" w:eastAsia="Calibri"/>
+          <w:b w:val="0"/>
+          <w:sz w:val="22"/>
+        </w:rPr>
+        <w:t>**Product:** AP Agent OS — Evidence Room</w:t>
+      </w:r>
+    </w:p>
+    <w:p>
+      <w:r>
+        <w:rPr>
+          <w:rFonts w:ascii="Calibri" w:hAnsi="Calibri" w:eastAsia="Calibri"/>
+          <w:b w:val="0"/>
+          <w:sz w:val="22"/>
+        </w:rPr>
+        <w:t>**Type:** Binding operating standard for adopters of this pack</w:t>
+      </w:r>
+    </w:p>
+    <w:p>
+      <w:r>
+        <w:rPr>
+          <w:rFonts w:ascii="Calibri" w:hAnsi="Calibri" w:eastAsia="Calibri"/>
+          <w:b w:val="0"/>
+          <w:sz w:val="22"/>
+        </w:rPr>
+        <w:t>**Relationship:** Compresses `GOVERNANCE_FRAMEWORK.md` into shall / shall-not statements. If the two conflict, this standard wins until the framework is revised.</w:t>
+      </w:r>
+    </w:p>
+    <w:p>
+      <w:r>
+        <w:rPr>
+          <w:rFonts w:ascii="Calibri" w:hAnsi="Calibri" w:eastAsia="Calibri"/>
+          <w:b w:val="0"/>
+          <w:sz w:val="22"/>
+        </w:rPr>
+        <w:t>**Not:** A certification, a legal opinion, or a claim of alignment to NIST AI RMF or ISO/IEC 42001. Those frameworks may be considered separately.</w:t>
+      </w:r>
+    </w:p>
+    <w:p>
+      <w:r>
+        <w:rPr>
+          <w:rFonts w:ascii="Calibri" w:hAnsi="Calibri" w:eastAsia="Calibri"/>
+          <w:b w:val="0"/>
+          <w:sz w:val="22"/>
+        </w:rPr>
+        <w:t>**Example:** Northline Industrials applies this standard to all 16 agents.</w:t>
+      </w:r>
+    </w:p>
+    <w:p>
+      <w:pPr>
+        <w:pStyle w:val="Heading2"/>
+      </w:pPr>
+      <w:r>
+        <w:rPr>
+          <w:color w:val="12160F"/>
+        </w:rPr>
+        <w:t>0. Application</w:t>
+      </w:r>
+    </w:p>
+    <w:p>
+      <w:r>
+        <w:rPr>
+          <w:rFonts w:ascii="Calibri" w:hAnsi="Calibri" w:eastAsia="Calibri"/>
+          <w:b w:val="0"/>
+          <w:sz w:val="22"/>
+        </w:rPr>
+        <w:t>This standard applies from the first shadow run. Mapping and historical testing may proceed before full RBAC automation, but **no live proposal** is shown to processors until sections 1–8 are met.</w:t>
+      </w:r>
+    </w:p>
+    <w:p>
+      <w:r>
+        <w:rPr>
+          <w:rFonts w:ascii="Calibri" w:hAnsi="Calibri" w:eastAsia="Calibri"/>
+          <w:b w:val="0"/>
+          <w:sz w:val="22"/>
+        </w:rPr>
+        <w:t>Local policies that are stricter prevail. Local policies that are looser require a written waiver from the control owner, with expiry.</w:t>
+      </w:r>
+    </w:p>
+    <w:p>
+      <w:pPr>
+        <w:pStyle w:val="Heading2"/>
+      </w:pPr>
+      <w:r>
+        <w:rPr>
+          <w:color w:val="12160F"/>
+        </w:rPr>
+        <w:t>1. Accountability</w:t>
+      </w:r>
+    </w:p>
+    <w:p>
+      <w:r>
+        <w:rPr>
+          <w:rFonts w:ascii="Calibri" w:hAnsi="Calibri" w:eastAsia="Calibri"/>
+          <w:b w:val="0"/>
+          <w:sz w:val="22"/>
+        </w:rPr>
+        <w:t>1.1 Each process path shall have one human process owner.</w:t>
+      </w:r>
+    </w:p>
+    <w:p>
+      <w:r>
+        <w:rPr>
+          <w:rFonts w:ascii="Calibri" w:hAnsi="Calibri" w:eastAsia="Calibri"/>
+          <w:b w:val="0"/>
+          <w:sz w:val="22"/>
+        </w:rPr>
+        <w:t>1.2 Each production agent shall have one human owner named on the control matrix.</w:t>
+      </w:r>
+    </w:p>
+    <w:p>
+      <w:r>
+        <w:rPr>
+          <w:rFonts w:ascii="Calibri" w:hAnsi="Calibri" w:eastAsia="Calibri"/>
+          <w:b w:val="0"/>
+          <w:sz w:val="22"/>
+        </w:rPr>
+        <w:t>1.3 Agents shall not be Accountable on the RACI.</w:t>
+      </w:r>
+    </w:p>
+    <w:p>
+      <w:r>
+        <w:rPr>
+          <w:rFonts w:ascii="Calibri" w:hAnsi="Calibri" w:eastAsia="Calibri"/>
+          <w:b w:val="0"/>
+          <w:sz w:val="22"/>
+        </w:rPr>
+        <w:t>1.4 Every ERP commit shall name a human performer of record.</w:t>
+      </w:r>
+    </w:p>
+    <w:p>
+      <w:r>
+        <w:rPr>
+          <w:rFonts w:ascii="Calibri" w:hAnsi="Calibri" w:eastAsia="Calibri"/>
+          <w:b w:val="0"/>
+          <w:sz w:val="22"/>
+        </w:rPr>
+        <w:t>1.5 Dual approval (process owner and control owner) shall be required to expand agent authority, to change tolerances, or to change allowed tools.</w:t>
+      </w:r>
+    </w:p>
+    <w:p>
+      <w:pPr>
+        <w:pStyle w:val="Heading2"/>
+      </w:pPr>
+      <w:r>
+        <w:rPr>
+          <w:color w:val="12160F"/>
+        </w:rPr>
+        <w:t>2. Authority boundaries</w:t>
+      </w:r>
+    </w:p>
+    <w:p>
+      <w:r>
+        <w:rPr>
+          <w:rFonts w:ascii="Calibri" w:hAnsi="Calibri" w:eastAsia="Calibri"/>
+          <w:b w:val="0"/>
+          <w:sz w:val="22"/>
+        </w:rPr>
+        <w:t>2.1 Agents shall not release payments, lift payment holds, or generate a payment file.</w:t>
+      </w:r>
+    </w:p>
+    <w:p>
+      <w:r>
+        <w:rPr>
+          <w:rFonts w:ascii="Calibri" w:hAnsi="Calibri" w:eastAsia="Calibri"/>
+          <w:b w:val="0"/>
+          <w:sz w:val="22"/>
+        </w:rPr>
+        <w:t>2.2 Agents shall not approve spend or amend DOA limits.</w:t>
+      </w:r>
+    </w:p>
+    <w:p>
+      <w:r>
+        <w:rPr>
+          <w:rFonts w:ascii="Calibri" w:hAnsi="Calibri" w:eastAsia="Calibri"/>
+          <w:b w:val="0"/>
+          <w:sz w:val="22"/>
+        </w:rPr>
+        <w:t>2.3 Agents shall not create or amend supplier bank details, tax masters, or cost-centre masters.</w:t>
+      </w:r>
+    </w:p>
+    <w:p>
+      <w:r>
+        <w:rPr>
+          <w:rFonts w:ascii="Calibri" w:hAnsi="Calibri" w:eastAsia="Calibri"/>
+          <w:b w:val="0"/>
+          <w:sz w:val="22"/>
+        </w:rPr>
+        <w:t>2.4 Agents shall not create GRNs or re-open POs.</w:t>
+      </w:r>
+    </w:p>
+    <w:p>
+      <w:r>
+        <w:rPr>
+          <w:rFonts w:ascii="Calibri" w:hAnsi="Calibri" w:eastAsia="Calibri"/>
+          <w:b w:val="0"/>
+          <w:sz w:val="22"/>
+        </w:rPr>
+        <w:t>2.5 Agents shall not construct invoice numbers or payable amounts that are not on the face or in a retrieved system object.</w:t>
+      </w:r>
+    </w:p>
+    <w:p>
+      <w:r>
+        <w:rPr>
+          <w:rFonts w:ascii="Calibri" w:hAnsi="Calibri" w:eastAsia="Calibri"/>
+          <w:b w:val="0"/>
+          <w:sz w:val="22"/>
+        </w:rPr>
+        <w:t>2.6 Agents shall not post from a statement line.</w:t>
+      </w:r>
+    </w:p>
+    <w:p>
+      <w:r>
+        <w:rPr>
+          <w:rFonts w:ascii="Calibri" w:hAnsi="Calibri" w:eastAsia="Calibri"/>
+          <w:b w:val="0"/>
+          <w:sz w:val="22"/>
+        </w:rPr>
+        <w:t>2.7 First release shall be propose / draft / flag / assemble / route / chase-draft only, unless a signed expansion record exists.</w:t>
+      </w:r>
+    </w:p>
+    <w:p>
+      <w:r>
+        <w:rPr>
+          <w:rFonts w:ascii="Calibri" w:hAnsi="Calibri" w:eastAsia="Calibri"/>
+          <w:b w:val="0"/>
+          <w:sz w:val="22"/>
+        </w:rPr>
+        <w:t>2.8 Forbidden-action lists shall be written on the agentisation sheet and the SOP. Implied forbids are non-conformant.</w:t>
+      </w:r>
+    </w:p>
+    <w:p>
+      <w:pPr>
+        <w:pStyle w:val="Heading2"/>
+      </w:pPr>
+      <w:r>
+        <w:rPr>
+          <w:color w:val="12160F"/>
+        </w:rPr>
+        <w:t>3. Segregation of duties and access</w:t>
+      </w:r>
+    </w:p>
+    <w:p>
+      <w:r>
+        <w:rPr>
+          <w:rFonts w:ascii="Calibri" w:hAnsi="Calibri" w:eastAsia="Calibri"/>
+          <w:b w:val="0"/>
+          <w:sz w:val="22"/>
+        </w:rPr>
+        <w:t>3.1 Confirming a duplicate close shall not be performed by the original capturer when another qualified person is available.</w:t>
+      </w:r>
+    </w:p>
+    <w:p>
+      <w:r>
+        <w:rPr>
+          <w:rFonts w:ascii="Calibri" w:hAnsi="Calibri" w:eastAsia="Calibri"/>
+          <w:b w:val="0"/>
+          <w:sz w:val="22"/>
+        </w:rPr>
+        <w:t>3.2 Bank-master change and EX-BNK park shall not be performed by the same person in the same episode.</w:t>
+      </w:r>
+    </w:p>
+    <w:p>
+      <w:r>
+        <w:rPr>
+          <w:rFonts w:ascii="Calibri" w:hAnsi="Calibri" w:eastAsia="Calibri"/>
+          <w:b w:val="0"/>
+          <w:sz w:val="22"/>
+        </w:rPr>
+        <w:t>3.3 Prompt/config change and production release shall not be performed by the same person.</w:t>
+      </w:r>
+    </w:p>
+    <w:p>
+      <w:r>
+        <w:rPr>
+          <w:rFonts w:ascii="Calibri" w:hAnsi="Calibri" w:eastAsia="Calibri"/>
+          <w:b w:val="0"/>
+          <w:sz w:val="22"/>
+        </w:rPr>
+        <w:t>3.4 Agent service principals shall use least privilege. Delete-mail, void, approve, post, and master-write shall be absent unless a current expansion record grants a specific write.</w:t>
+      </w:r>
+    </w:p>
+    <w:p>
+      <w:r>
+        <w:rPr>
+          <w:rFonts w:ascii="Calibri" w:hAnsi="Calibri" w:eastAsia="Calibri"/>
+          <w:b w:val="0"/>
+          <w:sz w:val="22"/>
+        </w:rPr>
+        <w:t>3.5 Shared posting accounts shall not be used.</w:t>
+      </w:r>
+    </w:p>
+    <w:p>
+      <w:r>
+        <w:rPr>
+          <w:rFonts w:ascii="Calibri" w:hAnsi="Calibri" w:eastAsia="Calibri"/>
+          <w:b w:val="0"/>
+          <w:sz w:val="22"/>
+        </w:rPr>
+        <w:t>3.6 Access shall end the same day a person leaves the role.</w:t>
+      </w:r>
+    </w:p>
+    <w:p>
+      <w:r>
+        <w:rPr>
+          <w:rFonts w:ascii="Calibri" w:hAnsi="Calibri" w:eastAsia="Calibri"/>
+          <w:b w:val="0"/>
+          <w:sz w:val="22"/>
+        </w:rPr>
+        <w:t>3.7 Human and agent access shall be certified at least quarterly.</w:t>
+      </w:r>
+    </w:p>
+    <w:p>
+      <w:pPr>
+        <w:pStyle w:val="Heading2"/>
+      </w:pPr>
+      <w:r>
+        <w:rPr>
+          <w:color w:val="12160F"/>
+        </w:rPr>
+        <w:t>4. Untrusted content, privacy, and output</w:t>
+      </w:r>
+    </w:p>
+    <w:p>
+      <w:r>
+        <w:rPr>
+          <w:rFonts w:ascii="Calibri" w:hAnsi="Calibri" w:eastAsia="Calibri"/>
+          <w:b w:val="0"/>
+          <w:sz w:val="22"/>
+        </w:rPr>
+        <w:t>4.1 Invoice images, email bodies, and statements shall be treated as untrusted. They shall not override system instructions or tool policy.</w:t>
+      </w:r>
+    </w:p>
+    <w:p>
+      <w:r>
+        <w:rPr>
+          <w:rFonts w:ascii="Calibri" w:hAnsi="Calibri" w:eastAsia="Calibri"/>
+          <w:b w:val="0"/>
+          <w:sz w:val="22"/>
+        </w:rPr>
+        <w:t>4.2 Agents shall call only allow-listed tools.</w:t>
+      </w:r>
+    </w:p>
+    <w:p>
+      <w:r>
+        <w:rPr>
+          <w:rFonts w:ascii="Calibri" w:hAnsi="Calibri" w:eastAsia="Calibri"/>
+          <w:b w:val="0"/>
+          <w:sz w:val="22"/>
+        </w:rPr>
+        <w:t>4.3 Agents shall not fetch arbitrary URLs found on documents.</w:t>
+      </w:r>
+    </w:p>
+    <w:p>
+      <w:r>
+        <w:rPr>
+          <w:rFonts w:ascii="Calibri" w:hAnsi="Calibri" w:eastAsia="Calibri"/>
+          <w:b w:val="0"/>
+          <w:sz w:val="22"/>
+        </w:rPr>
+        <w:t>4.4 Required output fields shall carry a citation to a retrieved object or a face location.</w:t>
+      </w:r>
+    </w:p>
+    <w:p>
+      <w:r>
+        <w:rPr>
+          <w:rFonts w:ascii="Calibri" w:hAnsi="Calibri" w:eastAsia="Calibri"/>
+          <w:b w:val="0"/>
+          <w:sz w:val="22"/>
+        </w:rPr>
+        <w:t>4.5 Output shall pass schema, tree-leaf, authority, and confidence validation before it is marked ready.</w:t>
+      </w:r>
+    </w:p>
+    <w:p>
+      <w:r>
+        <w:rPr>
+          <w:rFonts w:ascii="Calibri" w:hAnsi="Calibri" w:eastAsia="Calibri"/>
+          <w:b w:val="0"/>
+          <w:sz w:val="22"/>
+        </w:rPr>
+        <w:t>4.6 Personal data shall be limited to the item in hand. Full-mailbox prompts are non-conformant.</w:t>
+      </w:r>
+    </w:p>
+    <w:p>
+      <w:r>
+        <w:rPr>
+          <w:rFonts w:ascii="Calibri" w:hAnsi="Calibri" w:eastAsia="Calibri"/>
+          <w:b w:val="0"/>
+          <w:sz w:val="22"/>
+        </w:rPr>
+        <w:t>4.7 Bank identifiers shall be masked in default displays and in non-EX-BNK prompts.</w:t>
+      </w:r>
+    </w:p>
+    <w:p>
+      <w:r>
+        <w:rPr>
+          <w:rFonts w:ascii="Calibri" w:hAnsi="Calibri" w:eastAsia="Calibri"/>
+          <w:b w:val="0"/>
+          <w:sz w:val="22"/>
+        </w:rPr>
+        <w:t>4.8 Production content shall not be used to train a shared external model without a written agreement and a privacy review.</w:t>
+      </w:r>
+    </w:p>
+    <w:p>
+      <w:pPr>
+        <w:pStyle w:val="Heading2"/>
+      </w:pPr>
+      <w:r>
+        <w:rPr>
+          <w:color w:val="12160F"/>
+        </w:rPr>
+        <w:t>5. Records</w:t>
+      </w:r>
+    </w:p>
+    <w:p>
+      <w:r>
+        <w:rPr>
+          <w:rFonts w:ascii="Calibri" w:hAnsi="Calibri" w:eastAsia="Calibri"/>
+          <w:b w:val="0"/>
+          <w:sz w:val="22"/>
+        </w:rPr>
+        <w:t>5.1 Audit logs shall include agent version, config hash, object id, proposal, validation result, human decision, and write attempts.</w:t>
+      </w:r>
+    </w:p>
+    <w:p>
+      <w:r>
+        <w:rPr>
+          <w:rFonts w:ascii="Calibri" w:hAnsi="Calibri" w:eastAsia="Calibri"/>
+          <w:b w:val="0"/>
+          <w:sz w:val="22"/>
+        </w:rPr>
+        <w:t>5.2 Logs shall be append-only to business users.</w:t>
+      </w:r>
+    </w:p>
+    <w:p>
+      <w:r>
+        <w:rPr>
+          <w:rFonts w:ascii="Calibri" w:hAnsi="Calibri" w:eastAsia="Calibri"/>
+          <w:b w:val="0"/>
+          <w:sz w:val="22"/>
+        </w:rPr>
+        <w:t>5.3 Process maps, trees, SOPs, prompts, model ids, and tolerance tables shall be versioned.</w:t>
+      </w:r>
+    </w:p>
+    <w:p>
+      <w:r>
+        <w:rPr>
+          <w:rFonts w:ascii="Calibri" w:hAnsi="Calibri" w:eastAsia="Calibri"/>
+          <w:b w:val="0"/>
+          <w:sz w:val="22"/>
+        </w:rPr>
+        <w:t>5.4 A posted invoice shall be reconstructable against the versions that processed it.</w:t>
+      </w:r>
+    </w:p>
+    <w:p>
+      <w:r>
+        <w:rPr>
+          <w:rFonts w:ascii="Calibri" w:hAnsi="Calibri" w:eastAsia="Calibri"/>
+          <w:b w:val="0"/>
+          <w:sz w:val="22"/>
+        </w:rPr>
+        <w:t>5.5 Retention shall follow the organisation’s records schedule and the evidence table in the framework.</w:t>
+      </w:r>
+    </w:p>
+    <w:p>
+      <w:r>
+        <w:rPr>
+          <w:rFonts w:ascii="Calibri" w:hAnsi="Calibri" w:eastAsia="Calibri"/>
+          <w:b w:val="0"/>
+          <w:sz w:val="22"/>
+        </w:rPr>
+        <w:t>5.6 Evidence packs shall not be described as certifications.</w:t>
+      </w:r>
+    </w:p>
+    <w:p>
+      <w:pPr>
+        <w:pStyle w:val="Heading2"/>
+      </w:pPr>
+      <w:r>
+        <w:rPr>
+          <w:color w:val="12160F"/>
+        </w:rPr>
+        <w:t>6. Change, test, and release</w:t>
+      </w:r>
+    </w:p>
+    <w:p>
+      <w:r>
+        <w:rPr>
+          <w:rFonts w:ascii="Calibri" w:hAnsi="Calibri" w:eastAsia="Calibri"/>
+          <w:b w:val="0"/>
+          <w:sz w:val="22"/>
+        </w:rPr>
+        <w:t>6.1 Model changes and workflow changes shall follow change request, historical test, comparison against current behaviour, and control-owner release.</w:t>
+      </w:r>
+    </w:p>
+    <w:p>
+      <w:r>
+        <w:rPr>
+          <w:rFonts w:ascii="Calibri" w:hAnsi="Calibri" w:eastAsia="Calibri"/>
+          <w:b w:val="0"/>
+          <w:sz w:val="22"/>
+        </w:rPr>
+        <w:t>6.2 The person who tunes shall not score the sealed hold-out pack.</w:t>
+      </w:r>
+    </w:p>
+    <w:p>
+      <w:r>
+        <w:rPr>
+          <w:rFonts w:ascii="Calibri" w:hAnsi="Calibri" w:eastAsia="Calibri"/>
+          <w:b w:val="0"/>
+          <w:sz w:val="22"/>
+        </w:rPr>
+        <w:t>6.3 Shadow shall complete before a controlled pilot.</w:t>
+      </w:r>
+    </w:p>
+    <w:p>
+      <w:r>
+        <w:rPr>
+          <w:rFonts w:ascii="Calibri" w:hAnsi="Calibri" w:eastAsia="Calibri"/>
+          <w:b w:val="0"/>
+          <w:sz w:val="22"/>
+        </w:rPr>
+        <w:t>6.4 A kill-switch shall name a person, a deputy, an action, and a time to effect, before the first live proposal.</w:t>
+      </w:r>
+    </w:p>
+    <w:p>
+      <w:r>
+        <w:rPr>
+          <w:rFonts w:ascii="Calibri" w:hAnsi="Calibri" w:eastAsia="Calibri"/>
+          <w:b w:val="0"/>
+          <w:sz w:val="22"/>
+        </w:rPr>
+        <w:t>6.5 Rollback shall be identified before production release.</w:t>
+      </w:r>
+    </w:p>
+    <w:p>
+      <w:r>
+        <w:rPr>
+          <w:rFonts w:ascii="Calibri" w:hAnsi="Calibri" w:eastAsia="Calibri"/>
+          <w:b w:val="0"/>
+          <w:sz w:val="22"/>
+        </w:rPr>
+        <w:t>6.6 Stale evidence (process, ERP, or model changed since the test) shall not support expansion.</w:t>
+      </w:r>
+    </w:p>
+    <w:p>
+      <w:pPr>
+        <w:pStyle w:val="Heading2"/>
+      </w:pPr>
+      <w:r>
+        <w:rPr>
+          <w:color w:val="12160F"/>
+        </w:rPr>
+        <w:t>7. Exceptions and language</w:t>
+      </w:r>
+    </w:p>
+    <w:p>
+      <w:r>
+        <w:rPr>
+          <w:rFonts w:ascii="Calibri" w:hAnsi="Calibri" w:eastAsia="Calibri"/>
+          <w:b w:val="0"/>
+          <w:sz w:val="22"/>
+        </w:rPr>
+        <w:t>7.1 Park reasons shall use the taxonomy. Local codes shall follow the extension rule.</w:t>
+      </w:r>
+    </w:p>
+    <w:p>
+      <w:r>
+        <w:rPr>
+          <w:rFonts w:ascii="Calibri" w:hAnsi="Calibri" w:eastAsia="Calibri"/>
+          <w:b w:val="0"/>
+          <w:sz w:val="22"/>
+        </w:rPr>
+        <w:t>7.2 Critical codes (EX-DUP posted-risk, EX-ILE, EX-DOA, EX-BNK) shall route above the processor.</w:t>
+      </w:r>
+    </w:p>
+    <w:p>
+      <w:r>
+        <w:rPr>
+          <w:rFonts w:ascii="Calibri" w:hAnsi="Calibri" w:eastAsia="Calibri"/>
+          <w:b w:val="0"/>
+          <w:sz w:val="22"/>
+        </w:rPr>
+        <w:t>7.3 EX-AGE shall be added, not used as the sole original code.</w:t>
+      </w:r>
+    </w:p>
+    <w:p>
+      <w:r>
+        <w:rPr>
+          <w:rFonts w:ascii="Calibri" w:hAnsi="Calibri" w:eastAsia="Calibri"/>
+          <w:b w:val="0"/>
+          <w:sz w:val="22"/>
+        </w:rPr>
+        <w:t>7.4 User-facing text shall not claim guaranteed savings, fraud detection, compliance, accounting accuracy, autonomous payments, or ROI.</w:t>
+      </w:r>
+    </w:p>
+    <w:p>
+      <w:r>
+        <w:rPr>
+          <w:rFonts w:ascii="Calibri" w:hAnsi="Calibri" w:eastAsia="Calibri"/>
+          <w:b w:val="0"/>
+          <w:sz w:val="22"/>
+        </w:rPr>
+        <w:t>7.5 Duplicate and bank-mismatch controls shall be described as error-reduction controls, not as a fraud programme.</w:t>
+      </w:r>
+    </w:p>
+    <w:p>
+      <w:r>
+        <w:rPr>
+          <w:rFonts w:ascii="Calibri" w:hAnsi="Calibri" w:eastAsia="Calibri"/>
+          <w:b w:val="0"/>
+          <w:sz w:val="22"/>
+        </w:rPr>
+        <w:t>7.6 Estimated hours shall not be labelled validated financial savings.</w:t>
+      </w:r>
+    </w:p>
+    <w:p>
+      <w:pPr>
+        <w:pStyle w:val="Heading2"/>
+      </w:pPr>
+      <w:r>
+        <w:rPr>
+          <w:color w:val="12160F"/>
+        </w:rPr>
+        <w:t>8. Incidents, override, fallback</w:t>
+      </w:r>
+    </w:p>
+    <w:p>
+      <w:r>
+        <w:rPr>
+          <w:rFonts w:ascii="Calibri" w:hAnsi="Calibri" w:eastAsia="Calibri"/>
+          <w:b w:val="0"/>
+          <w:sz w:val="22"/>
+        </w:rPr>
+        <w:t>8.1 Unauthorised writes, duplicate posts, entity mis-posts, payee-data incidents, injection successes, privacy spills, and lost logs shall be incidents.</w:t>
+      </w:r>
+    </w:p>
+    <w:p>
+      <w:r>
+        <w:rPr>
+          <w:rFonts w:ascii="Calibri" w:hAnsi="Calibri" w:eastAsia="Calibri"/>
+          <w:b w:val="0"/>
+          <w:sz w:val="22"/>
+        </w:rPr>
+        <w:t>8.2 The affected agent or path shall be stopped, logs preserved, and commit-landed checked before retry.</w:t>
+      </w:r>
+    </w:p>
+    <w:p>
+      <w:r>
+        <w:rPr>
+          <w:rFonts w:ascii="Calibri" w:hAnsi="Calibri" w:eastAsia="Calibri"/>
+          <w:b w:val="0"/>
+          <w:sz w:val="22"/>
+        </w:rPr>
+        <w:t>8.3 Return to service shall use the release path.</w:t>
+      </w:r>
+    </w:p>
+    <w:p>
+      <w:r>
+        <w:rPr>
+          <w:rFonts w:ascii="Calibri" w:hAnsi="Calibri" w:eastAsia="Calibri"/>
+          <w:b w:val="0"/>
+          <w:sz w:val="22"/>
+        </w:rPr>
+        <w:t>8.4 Overrides shall be attributable and sampled.</w:t>
+      </w:r>
+    </w:p>
+    <w:p>
+      <w:r>
+        <w:rPr>
+          <w:rFonts w:ascii="Calibri" w:hAnsi="Calibri" w:eastAsia="Calibri"/>
+          <w:b w:val="0"/>
+          <w:sz w:val="22"/>
+        </w:rPr>
+        <w:t>8.5 The human SOP shall remain executable without agents.</w:t>
+      </w:r>
+    </w:p>
+    <w:p>
+      <w:r>
+        <w:rPr>
+          <w:rFonts w:ascii="Calibri" w:hAnsi="Calibri" w:eastAsia="Calibri"/>
+          <w:b w:val="0"/>
+          <w:sz w:val="22"/>
+        </w:rPr>
+        <w:t>8.6 Agents shall not be the continuity plan for invoice-to-pay.</w:t>
+      </w:r>
+    </w:p>
+    <w:p>
+      <w:pPr>
+        <w:pStyle w:val="Heading2"/>
+      </w:pPr>
+      <w:r>
+        <w:rPr>
+          <w:color w:val="12160F"/>
+        </w:rPr>
+        <w:t>9. Measurement</w:t>
+      </w:r>
+    </w:p>
+    <w:p>
+      <w:r>
+        <w:rPr>
+          <w:rFonts w:ascii="Calibri" w:hAnsi="Calibri" w:eastAsia="Calibri"/>
+          <w:b w:val="0"/>
+          <w:sz w:val="22"/>
+        </w:rPr>
+        <w:t>9.1 Scorecards shall separate Activity, Operational, Financial, and Risk-control measures as defined in `../KPI_and_Measurement/KPI_FRAMEWORK.md`.</w:t>
+      </w:r>
+    </w:p>
+    <w:p>
+      <w:r>
+        <w:rPr>
+          <w:rFonts w:ascii="Calibri" w:hAnsi="Calibri" w:eastAsia="Calibri"/>
+          <w:b w:val="0"/>
+          <w:sz w:val="22"/>
+        </w:rPr>
+        <w:t>9.2 Risk-control breaches may veto expansion regardless of operational measures.</w:t>
+      </w:r>
+    </w:p>
+    <w:p>
+      <w:r>
+        <w:rPr>
+          <w:rFonts w:ascii="Calibri" w:hAnsi="Calibri" w:eastAsia="Calibri"/>
+          <w:b w:val="0"/>
+          <w:sz w:val="22"/>
+        </w:rPr>
+        <w:t>9.3 Definitions shall be locked before a pilot window. Mid-window formula changes invalidate the comparison unless the control owner restarts the window.</w:t>
+      </w:r>
+    </w:p>
+    <w:p>
+      <w:pPr>
+        <w:pStyle w:val="Heading2"/>
+      </w:pPr>
+      <w:r>
+        <w:rPr>
+          <w:color w:val="12160F"/>
+        </w:rPr>
+        <w:t>10. Vendor and model</w:t>
+      </w:r>
+    </w:p>
+    <w:p>
+      <w:r>
+        <w:rPr>
+          <w:rFonts w:ascii="Calibri" w:hAnsi="Calibri" w:eastAsia="Calibri"/>
+          <w:b w:val="0"/>
+          <w:sz w:val="22"/>
+        </w:rPr>
+        <w:t>10.1 Model hosting, training-use, deprecation, and incident notice shall be assessed before production data is sent.</w:t>
+      </w:r>
+    </w:p>
+    <w:p>
+      <w:r>
+        <w:rPr>
+          <w:rFonts w:ascii="Calibri" w:hAnsi="Calibri" w:eastAsia="Calibri"/>
+          <w:b w:val="0"/>
+          <w:sz w:val="22"/>
+        </w:rPr>
+        <w:t>10.2 Model ids shall be pinned where the vendor allows. Forced swaps are incidents.</w:t>
+      </w:r>
+    </w:p>
+    <w:p>
+      <w:r>
+        <w:rPr>
+          <w:rFonts w:ascii="Calibri" w:hAnsi="Calibri" w:eastAsia="Calibri"/>
+          <w:b w:val="0"/>
+          <w:sz w:val="22"/>
+        </w:rPr>
+        <w:t>10.3 A completed vendor questionnaire shall not replace output validation or human posting control.</w:t>
+      </w:r>
+    </w:p>
+    <w:p>
+      <w:pPr>
+        <w:pStyle w:val="Heading2"/>
+      </w:pPr>
+      <w:r>
+        <w:rPr>
+          <w:color w:val="12160F"/>
+        </w:rPr>
+        <w:t>11. External frameworks</w:t>
+      </w:r>
+    </w:p>
+    <w:p>
+      <w:r>
+        <w:rPr>
+          <w:rFonts w:ascii="Calibri" w:hAnsi="Calibri" w:eastAsia="Calibri"/>
+          <w:b w:val="0"/>
+          <w:sz w:val="22"/>
+        </w:rPr>
+        <w:t>11.1 NIST AI RMF and ISO/IEC 42001 may be considered when the organisation already runs an AI or control programme.</w:t>
+      </w:r>
+    </w:p>
+    <w:p>
+      <w:r>
+        <w:rPr>
+          <w:rFonts w:ascii="Calibri" w:hAnsi="Calibri" w:eastAsia="Calibri"/>
+          <w:b w:val="0"/>
+          <w:sz w:val="22"/>
+        </w:rPr>
+        <w:t>11.2 No team shall state that this product pack, an implementation, or Northline Industrials is certified to, or officially aligned with, those frameworks on the basis of this standard.</w:t>
+      </w:r>
+    </w:p>
+    <w:p>
+      <w:pPr>
+        <w:pStyle w:val="Heading2"/>
+      </w:pPr>
+      <w:r>
+        <w:rPr>
+          <w:color w:val="12160F"/>
+        </w:rPr>
+        <w:t>12. Waivers</w:t>
+      </w:r>
+    </w:p>
+    <w:p>
+      <w:r>
+        <w:rPr>
+          <w:rFonts w:ascii="Calibri" w:hAnsi="Calibri" w:eastAsia="Calibri"/>
+          <w:b w:val="0"/>
+          <w:sz w:val="22"/>
+        </w:rPr>
+        <w:t>12.1 A waiver shall name the clause, the path, the expiry, the residual risk id, and the control-owner signature.</w:t>
+      </w:r>
+    </w:p>
+    <w:p>
+      <w:r>
+        <w:rPr>
+          <w:rFonts w:ascii="Calibri" w:hAnsi="Calibri" w:eastAsia="Calibri"/>
+          <w:b w:val="0"/>
+          <w:sz w:val="22"/>
+        </w:rPr>
+        <w:t>12.2 Waivers shall not cover sections 2.1–2.6 (payment, approve, masters, GRN/PO writes, invented amounts, statement posting).</w:t>
+      </w:r>
+    </w:p>
+    <w:p>
+      <w:r>
+        <w:rPr>
+          <w:rFonts w:ascii="Calibri" w:hAnsi="Calibri" w:eastAsia="Calibri"/>
+          <w:b w:val="0"/>
+          <w:sz w:val="22"/>
+        </w:rPr>
+        <w:t>12.3 Expired waivers shall be treated as non-conformant the next working day.</w:t>
+      </w:r>
+    </w:p>
+    <w:p>
+      <w:pPr>
+        <w:pStyle w:val="Heading2"/>
+      </w:pPr>
+      <w:r>
+        <w:rPr>
+          <w:color w:val="12160F"/>
+        </w:rPr>
+        <w:t>13. Conformity review</w:t>
+      </w:r>
+    </w:p>
+    <w:tbl>
+      <w:tblPr>
+        <w:tblStyle w:val="TableGrid"/>
+        <w:tblW w:type="auto" w:w="0"/>
+        <w:tblLook w:firstColumn="1" w:firstRow="1" w:lastColumn="0" w:lastRow="0" w:noHBand="0" w:noVBand="1" w:val="04A0"/>
+      </w:tblPr>
+      <w:tblGrid>
+        <w:gridCol w:w="3216"/>
+        <w:gridCol w:w="3216"/>
+        <w:gridCol w:w="3216"/>
+      </w:tblGrid>
+      <w:tr>
+        <w:tc>
+          <w:tcPr>
+            <w:tcW w:type="dxa" w:w="3216"/>
+          </w:tcPr>
+          <w:p>
+            <w:r>
+              <w:rPr>
+                <w:rFonts w:ascii="Calibri" w:hAnsi="Calibri" w:eastAsia="Calibri"/>
+                <w:b/>
+                <w:sz w:val="18"/>
+              </w:rPr>
+              <w:t>Review</w:t>
+            </w:r>
+          </w:p>
+        </w:tc>
+        <w:tc>
+          <w:tcPr>
+            <w:tcW w:type="dxa" w:w="3216"/>
+          </w:tcPr>
+          <w:p>
+            <w:r>
+              <w:rPr>
+                <w:rFonts w:ascii="Calibri" w:hAnsi="Calibri" w:eastAsia="Calibri"/>
+                <w:b/>
+                <w:sz w:val="18"/>
+              </w:rPr>
+              <w:t>Who</w:t>
+            </w:r>
+          </w:p>
+        </w:tc>
+        <w:tc>
+          <w:tcPr>
+            <w:tcW w:type="dxa" w:w="3216"/>
+          </w:tcPr>
+          <w:p>
+            <w:r>
+              <w:rPr>
+                <w:rFonts w:ascii="Calibri" w:hAnsi="Calibri" w:eastAsia="Calibri"/>
+                <w:b/>
+                <w:sz w:val="18"/>
+              </w:rPr>
+              <w:t>When</w:t>
+            </w:r>
+          </w:p>
+        </w:tc>
+      </w:tr>
+      <w:tr>
+        <w:tc>
+          <w:tcPr>
+            <w:tcW w:type="dxa" w:w="3216"/>
+          </w:tcPr>
+          <w:p>
+            <w:r>
+              <w:rPr>
+                <w:rFonts w:ascii="Calibri" w:hAnsi="Calibri" w:eastAsia="Calibri"/>
+                <w:b w:val="0"/>
+                <w:color w:val="12160F"/>
+                <w:sz w:val="18"/>
+              </w:rPr>
+              <w:t>Pre-shadow gate</w:t>
+            </w:r>
+          </w:p>
+        </w:tc>
+        <w:tc>
+          <w:tcPr>
+            <w:tcW w:type="dxa" w:w="3216"/>
+          </w:tcPr>
+          <w:p>
+            <w:r>
+              <w:rPr>
+                <w:rFonts w:ascii="Calibri" w:hAnsi="Calibri" w:eastAsia="Calibri"/>
+                <w:b w:val="0"/>
+                <w:color w:val="12160F"/>
+                <w:sz w:val="18"/>
+              </w:rPr>
+              <w:t>Process owner + control owner</w:t>
+            </w:r>
+          </w:p>
+        </w:tc>
+        <w:tc>
+          <w:tcPr>
+            <w:tcW w:type="dxa" w:w="3216"/>
+          </w:tcPr>
+          <w:p>
+            <w:r>
+              <w:rPr>
+                <w:rFonts w:ascii="Calibri" w:hAnsi="Calibri" w:eastAsia="Calibri"/>
+                <w:b w:val="0"/>
+                <w:color w:val="12160F"/>
+                <w:sz w:val="18"/>
+              </w:rPr>
+              <w:t>Before processors see proposals</w:t>
+            </w:r>
+          </w:p>
+        </w:tc>
+      </w:tr>
+      <w:tr>
+        <w:tc>
+          <w:tcPr>
+            <w:tcW w:type="dxa" w:w="3216"/>
+          </w:tcPr>
+          <w:p>
+            <w:r>
+              <w:rPr>
+                <w:rFonts w:ascii="Calibri" w:hAnsi="Calibri" w:eastAsia="Calibri"/>
+                <w:b w:val="0"/>
+                <w:color w:val="12160F"/>
+                <w:sz w:val="18"/>
+              </w:rPr>
+              <w:t>Pre-pilot gate</w:t>
+            </w:r>
+          </w:p>
+        </w:tc>
+        <w:tc>
+          <w:tcPr>
+            <w:tcW w:type="dxa" w:w="3216"/>
+          </w:tcPr>
+          <w:p>
+            <w:r>
+              <w:rPr>
+                <w:rFonts w:ascii="Calibri" w:hAnsi="Calibri" w:eastAsia="Calibri"/>
+                <w:b w:val="0"/>
+                <w:color w:val="12160F"/>
+                <w:sz w:val="18"/>
+              </w:rPr>
+              <w:t>Same + test lead</w:t>
+            </w:r>
+          </w:p>
+        </w:tc>
+        <w:tc>
+          <w:tcPr>
+            <w:tcW w:type="dxa" w:w="3216"/>
+          </w:tcPr>
+          <w:p>
+            <w:r>
+              <w:rPr>
+                <w:rFonts w:ascii="Calibri" w:hAnsi="Calibri" w:eastAsia="Calibri"/>
+                <w:b w:val="0"/>
+                <w:color w:val="12160F"/>
+                <w:sz w:val="18"/>
+              </w:rPr>
+              <w:t>Before first live action</w:t>
+            </w:r>
+          </w:p>
+        </w:tc>
+      </w:tr>
+      <w:tr>
+        <w:tc>
+          <w:tcPr>
+            <w:tcW w:type="dxa" w:w="3216"/>
+          </w:tcPr>
+          <w:p>
+            <w:r>
+              <w:rPr>
+                <w:rFonts w:ascii="Calibri" w:hAnsi="Calibri" w:eastAsia="Calibri"/>
+                <w:b w:val="0"/>
+                <w:color w:val="12160F"/>
+                <w:sz w:val="18"/>
+              </w:rPr>
+              <w:t>Quarterly certification</w:t>
+            </w:r>
+          </w:p>
+        </w:tc>
+        <w:tc>
+          <w:tcPr>
+            <w:tcW w:type="dxa" w:w="3216"/>
+          </w:tcPr>
+          <w:p>
+            <w:r>
+              <w:rPr>
+                <w:rFonts w:ascii="Calibri" w:hAnsi="Calibri" w:eastAsia="Calibri"/>
+                <w:b w:val="0"/>
+                <w:color w:val="12160F"/>
+                <w:sz w:val="18"/>
+              </w:rPr>
+              <w:t>Control owner</w:t>
+            </w:r>
+          </w:p>
+        </w:tc>
+        <w:tc>
+          <w:tcPr>
+            <w:tcW w:type="dxa" w:w="3216"/>
+          </w:tcPr>
+          <w:p>
+            <w:r>
+              <w:rPr>
+                <w:rFonts w:ascii="Calibri" w:hAnsi="Calibri" w:eastAsia="Calibri"/>
+                <w:b w:val="0"/>
+                <w:color w:val="12160F"/>
+                <w:sz w:val="18"/>
+              </w:rPr>
+              <w:t>Access, hashes, samples, kill-switch drill currency</w:t>
+            </w:r>
+          </w:p>
+        </w:tc>
+      </w:tr>
+      <w:tr>
+        <w:tc>
+          <w:tcPr>
+            <w:tcW w:type="dxa" w:w="3216"/>
+          </w:tcPr>
+          <w:p>
+            <w:r>
+              <w:rPr>
+                <w:rFonts w:ascii="Calibri" w:hAnsi="Calibri" w:eastAsia="Calibri"/>
+                <w:b w:val="0"/>
+                <w:color w:val="12160F"/>
+                <w:sz w:val="18"/>
+              </w:rPr>
+              <w:t>Incident</w:t>
+            </w:r>
+          </w:p>
+        </w:tc>
+        <w:tc>
+          <w:tcPr>
+            <w:tcW w:type="dxa" w:w="3216"/>
+          </w:tcPr>
+          <w:p>
+            <w:r>
+              <w:rPr>
+                <w:rFonts w:ascii="Calibri" w:hAnsi="Calibri" w:eastAsia="Calibri"/>
+                <w:b w:val="0"/>
+                <w:color w:val="12160F"/>
+                <w:sz w:val="18"/>
+              </w:rPr>
+              <w:t>Controller / privacy as applicable</w:t>
+            </w:r>
+          </w:p>
+        </w:tc>
+        <w:tc>
+          <w:tcPr>
+            <w:tcW w:type="dxa" w:w="3216"/>
+          </w:tcPr>
+          <w:p>
+            <w:r>
+              <w:rPr>
+                <w:rFonts w:ascii="Calibri" w:hAnsi="Calibri" w:eastAsia="Calibri"/>
+                <w:b w:val="0"/>
+                <w:color w:val="12160F"/>
+                <w:sz w:val="18"/>
+              </w:rPr>
+              <w:t>Per event</w:t>
+            </w:r>
+          </w:p>
+        </w:tc>
+      </w:tr>
+    </w:tbl>
+    <w:p>
+      <w:r>
+        <w:rPr>
+          <w:rFonts w:ascii="Calibri" w:hAnsi="Calibri" w:eastAsia="Calibri"/>
+          <w:b w:val="0"/>
+          <w:sz w:val="22"/>
+        </w:rPr>
+        <w:t>Northline pre-shadow gate for NIL PO-goods v03: sections 1–8 initialled by Chen and Shah on 2026-04-17, with R-17 and R-27 listed as open and out of agent scope until closed.</w:t>
+      </w:r>
+    </w:p>
+    <w:p>
+      <w:pPr>
+        <w:pStyle w:val="Heading2"/>
+      </w:pPr>
+      <w:r>
+        <w:rPr>
+          <w:color w:val="12160F"/>
+        </w:rPr>
+        <w:t>14. Non-conformity examples (for training)</w:t>
+      </w:r>
+    </w:p>
+    <w:tbl>
+      <w:tblPr>
+        <w:tblStyle w:val="TableGrid"/>
+        <w:tblW w:type="auto" w:w="0"/>
+        <w:tblLook w:firstColumn="1" w:firstRow="1" w:lastColumn="0" w:lastRow="0" w:noHBand="0" w:noVBand="1" w:val="04A0"/>
+      </w:tblPr>
+      <w:tblGrid>
+        <w:gridCol w:w="3216"/>
+        <w:gridCol w:w="3216"/>
+        <w:gridCol w:w="3216"/>
+      </w:tblGrid>
+      <w:tr>
+        <w:tc>
+          <w:tcPr>
+            <w:tcW w:type="dxa" w:w="3216"/>
+          </w:tcPr>
+          <w:p>
+            <w:r>
+              <w:rPr>
+                <w:rFonts w:ascii="Calibri" w:hAnsi="Calibri" w:eastAsia="Calibri"/>
+                <w:b/>
+                <w:sz w:val="18"/>
+              </w:rPr>
+              <w:t>Situation</w:t>
+            </w:r>
+          </w:p>
+        </w:tc>
+        <w:tc>
+          <w:tcPr>
+            <w:tcW w:type="dxa" w:w="3216"/>
+          </w:tcPr>
+          <w:p>
+            <w:r>
+              <w:rPr>
+                <w:rFonts w:ascii="Calibri" w:hAnsi="Calibri" w:eastAsia="Calibri"/>
+                <w:b/>
+                <w:sz w:val="18"/>
+              </w:rPr>
+              <w:t>Clause</w:t>
+            </w:r>
+          </w:p>
+        </w:tc>
+        <w:tc>
+          <w:tcPr>
+            <w:tcW w:type="dxa" w:w="3216"/>
+          </w:tcPr>
+          <w:p>
+            <w:r>
+              <w:rPr>
+                <w:rFonts w:ascii="Calibri" w:hAnsi="Calibri" w:eastAsia="Calibri"/>
+                <w:b/>
+                <w:sz w:val="18"/>
+              </w:rPr>
+              <w:t>Required response</w:t>
+            </w:r>
+          </w:p>
+        </w:tc>
+      </w:tr>
+      <w:tr>
+        <w:tc>
+          <w:tcPr>
+            <w:tcW w:type="dxa" w:w="3216"/>
+          </w:tcPr>
+          <w:p>
+            <w:r>
+              <w:rPr>
+                <w:rFonts w:ascii="Calibri" w:hAnsi="Calibri" w:eastAsia="Calibri"/>
+                <w:b w:val="0"/>
+                <w:color w:val="12160F"/>
+                <w:sz w:val="18"/>
+              </w:rPr>
+              <w:t>03 Matching posts a “clear” invoice overnight</w:t>
+            </w:r>
+          </w:p>
+        </w:tc>
+        <w:tc>
+          <w:tcPr>
+            <w:tcW w:type="dxa" w:w="3216"/>
+          </w:tcPr>
+          <w:p>
+            <w:r>
+              <w:rPr>
+                <w:rFonts w:ascii="Calibri" w:hAnsi="Calibri" w:eastAsia="Calibri"/>
+                <w:b w:val="0"/>
+                <w:color w:val="12160F"/>
+                <w:sz w:val="18"/>
+              </w:rPr>
+              <w:t>2.7, 2.4</w:t>
+            </w:r>
+          </w:p>
+        </w:tc>
+        <w:tc>
+          <w:tcPr>
+            <w:tcW w:type="dxa" w:w="3216"/>
+          </w:tcPr>
+          <w:p>
+            <w:r>
+              <w:rPr>
+                <w:rFonts w:ascii="Calibri" w:hAnsi="Calibri" w:eastAsia="Calibri"/>
+                <w:b w:val="0"/>
+                <w:color w:val="12160F"/>
+                <w:sz w:val="18"/>
+              </w:rPr>
+              <w:t>Incident; stop agent; reverse or leave per controller</w:t>
+            </w:r>
+          </w:p>
+        </w:tc>
+      </w:tr>
+      <w:tr>
+        <w:tc>
+          <w:tcPr>
+            <w:tcW w:type="dxa" w:w="3216"/>
+          </w:tcPr>
+          <w:p>
+            <w:r>
+              <w:rPr>
+                <w:rFonts w:ascii="Calibri" w:hAnsi="Calibri" w:eastAsia="Calibri"/>
+                <w:b w:val="0"/>
+                <w:color w:val="12160F"/>
+                <w:sz w:val="18"/>
+              </w:rPr>
+              <w:t>08 Supplier Resolution sends “we will pay Friday”</w:t>
+            </w:r>
+          </w:p>
+        </w:tc>
+        <w:tc>
+          <w:tcPr>
+            <w:tcW w:type="dxa" w:w="3216"/>
+          </w:tcPr>
+          <w:p>
+            <w:r>
+              <w:rPr>
+                <w:rFonts w:ascii="Calibri" w:hAnsi="Calibri" w:eastAsia="Calibri"/>
+                <w:b w:val="0"/>
+                <w:color w:val="12160F"/>
+                <w:sz w:val="18"/>
+              </w:rPr>
+              <w:t>2.1, 7.4</w:t>
+            </w:r>
+          </w:p>
+        </w:tc>
+        <w:tc>
+          <w:tcPr>
+            <w:tcW w:type="dxa" w:w="3216"/>
+          </w:tcPr>
+          <w:p>
+            <w:r>
+              <w:rPr>
+                <w:rFonts w:ascii="Calibri" w:hAnsi="Calibri" w:eastAsia="Calibri"/>
+                <w:b w:val="0"/>
+                <w:color w:val="12160F"/>
+                <w:sz w:val="18"/>
+              </w:rPr>
+              <w:t>Recall if possible; incident; template lock</w:t>
+            </w:r>
+          </w:p>
+        </w:tc>
+      </w:tr>
+      <w:tr>
+        <w:tc>
+          <w:tcPr>
+            <w:tcW w:type="dxa" w:w="3216"/>
+          </w:tcPr>
+          <w:p>
+            <w:r>
+              <w:rPr>
+                <w:rFonts w:ascii="Calibri" w:hAnsi="Calibri" w:eastAsia="Calibri"/>
+                <w:b w:val="0"/>
+                <w:color w:val="12160F"/>
+                <w:sz w:val="18"/>
+              </w:rPr>
+              <w:t>Implementer hot-swaps a model on Friday</w:t>
+            </w:r>
+          </w:p>
+        </w:tc>
+        <w:tc>
+          <w:tcPr>
+            <w:tcW w:type="dxa" w:w="3216"/>
+          </w:tcPr>
+          <w:p>
+            <w:r>
+              <w:rPr>
+                <w:rFonts w:ascii="Calibri" w:hAnsi="Calibri" w:eastAsia="Calibri"/>
+                <w:b w:val="0"/>
+                <w:color w:val="12160F"/>
+                <w:sz w:val="18"/>
+              </w:rPr>
+              <w:t>6.1, 10.2</w:t>
+            </w:r>
+          </w:p>
+        </w:tc>
+        <w:tc>
+          <w:tcPr>
+            <w:tcW w:type="dxa" w:w="3216"/>
+          </w:tcPr>
+          <w:p>
+            <w:r>
+              <w:rPr>
+                <w:rFonts w:ascii="Calibri" w:hAnsi="Calibri" w:eastAsia="Calibri"/>
+                <w:b w:val="0"/>
+                <w:color w:val="12160F"/>
+                <w:sz w:val="18"/>
+              </w:rPr>
+              <w:t>Incident; rollback; re-test</w:t>
+            </w:r>
+          </w:p>
+        </w:tc>
+      </w:tr>
+      <w:tr>
+        <w:tc>
+          <w:tcPr>
+            <w:tcW w:type="dxa" w:w="3216"/>
+          </w:tcPr>
+          <w:p>
+            <w:r>
+              <w:rPr>
+                <w:rFonts w:ascii="Calibri" w:hAnsi="Calibri" w:eastAsia="Calibri"/>
+                <w:b w:val="0"/>
+                <w:color w:val="12160F"/>
+                <w:sz w:val="18"/>
+              </w:rPr>
+              <w:t>Dashboard tile “AI fraud score”</w:t>
+            </w:r>
+          </w:p>
+        </w:tc>
+        <w:tc>
+          <w:tcPr>
+            <w:tcW w:type="dxa" w:w="3216"/>
+          </w:tcPr>
+          <w:p>
+            <w:r>
+              <w:rPr>
+                <w:rFonts w:ascii="Calibri" w:hAnsi="Calibri" w:eastAsia="Calibri"/>
+                <w:b w:val="0"/>
+                <w:color w:val="12160F"/>
+                <w:sz w:val="18"/>
+              </w:rPr>
+              <w:t>7.4, 7.5</w:t>
+            </w:r>
+          </w:p>
+        </w:tc>
+        <w:tc>
+          <w:tcPr>
+            <w:tcW w:type="dxa" w:w="3216"/>
+          </w:tcPr>
+          <w:p>
+            <w:r>
+              <w:rPr>
+                <w:rFonts w:ascii="Calibri" w:hAnsi="Calibri" w:eastAsia="Calibri"/>
+                <w:b w:val="0"/>
+                <w:color w:val="12160F"/>
+                <w:sz w:val="18"/>
+              </w:rPr>
+              <w:t>Remove before release</w:t>
+            </w:r>
+          </w:p>
+        </w:tc>
+      </w:tr>
+      <w:tr>
+        <w:tc>
+          <w:tcPr>
+            <w:tcW w:type="dxa" w:w="3216"/>
+          </w:tcPr>
+          <w:p>
+            <w:r>
+              <w:rPr>
+                <w:rFonts w:ascii="Calibri" w:hAnsi="Calibri" w:eastAsia="Calibri"/>
+                <w:b w:val="0"/>
+                <w:color w:val="12160F"/>
+                <w:sz w:val="18"/>
+              </w:rPr>
+              <w:t>Hours × rate shown as “savings delivered”</w:t>
+            </w:r>
+          </w:p>
+        </w:tc>
+        <w:tc>
+          <w:tcPr>
+            <w:tcW w:type="dxa" w:w="3216"/>
+          </w:tcPr>
+          <w:p>
+            <w:r>
+              <w:rPr>
+                <w:rFonts w:ascii="Calibri" w:hAnsi="Calibri" w:eastAsia="Calibri"/>
+                <w:b w:val="0"/>
+                <w:color w:val="12160F"/>
+                <w:sz w:val="18"/>
+              </w:rPr>
+              <w:t>7.6, 9.1</w:t>
+            </w:r>
+          </w:p>
+        </w:tc>
+        <w:tc>
+          <w:tcPr>
+            <w:tcW w:type="dxa" w:w="3216"/>
+          </w:tcPr>
+          <w:p>
+            <w:r>
+              <w:rPr>
+                <w:rFonts w:ascii="Calibri" w:hAnsi="Calibri" w:eastAsia="Calibri"/>
+                <w:b w:val="0"/>
+                <w:color w:val="12160F"/>
+                <w:sz w:val="18"/>
+              </w:rPr>
+              <w:t>Relabel as estimated hours; financial tile stays empty until validated</w:t>
+            </w:r>
+          </w:p>
+        </w:tc>
+      </w:tr>
+    </w:tbl>
+    <w:p>
+      <w:r>
+        <w:rPr>
+          <w:rFonts w:ascii="Calibri" w:hAnsi="Calibri" w:eastAsia="Calibri"/>
+          <w:b/>
+          <w:color w:val="12160F"/>
+          <w:sz w:val="20"/>
+        </w:rPr>
+        <w:t>Hard hold: agents do not approve, release, or transmit payment. Vendor-bank change and close attestation stay human.</w:t>
       </w:r>
     </w:p>
     <w:sectPr>
+      <w:headerReference w:type="default" r:id="rId9"/>
+      <w:footerReference w:type="default" r:id="rId10"/>
       <w:pgSz w:w="12240" w:h="15840"/>
-      <w:pgMar w:top="1296" w:right="1800" w:bottom="1296" w:left="1800" w:header="720" w:footer="720" w:gutter="0"/>
+      <w:pgMar w:top="1224" w:right="1296" w:bottom="1224" w:left="1296" w:header="720" w:footer="720" w:gutter="0"/>
       <w:cols w:space="720"/>
       <w:docGrid w:linePitch="360"/>
     </w:sectPr>
   </w:body>
 </w:document>
+</file>
+
+<file path=word/footer1.xml><?xml version="1.0" encoding="utf-8"?>
+<w:ftr xmlns:m="http://schemas.openxmlformats.org/officeDocument/2006/math" xmlns:mc="http://schemas.openxmlformats.org/markup-compatibility/2006" xmlns:mo="http://schemas.microsoft.com/office/mac/office/2008/main" xmlns:mv="urn:schemas-microsoft-com:mac:vml" xmlns:o="urn:schemas-microsoft-com:office:office" xmlns:r="http://schemas.openxmlformats.org/officeDocument/2006/relationships" xmlns:v="urn:schemas-microsoft-com:vml" xmlns:w10="urn:schemas-microsoft-com:office:word" xmlns:w14="http://schemas.microsoft.com/office/word/2010/wordml" xmlns:w="http://schemas.openxmlformats.org/wordprocessingml/2006/main" xmlns:wne="http://schemas.microsoft.com/office/word/2006/wordml" xmlns:wp14="http://schemas.microsoft.com/office/word/2010/wordprocessingDrawing" xmlns:wp="http://schemas.openxmlformats.org/drawingml/2006/wordprocessingDrawing" xmlns:wpc="http://schemas.microsoft.com/office/word/2010/wordprocessingCanvas" xmlns:wpg="http://schemas.microsoft.com/office/word/2010/wordprocessingGroup" xmlns:wpi="http://schemas.microsoft.com/office/word/2010/wordprocessingInk" xmlns:wps="http://schemas.microsoft.com/office/word/2010/wordprocessingShape" mc:Ignorable="w14 wp14">
+  <w:p>
+    <w:pPr>
+      <w:pStyle w:val="Footer"/>
+    </w:pPr>
+    <w:r>
+      <w:rPr>
+        <w:rFonts w:ascii="Calibri" w:hAnsi="Calibri" w:eastAsia="Calibri"/>
+        <w:b w:val="0"/>
+        <w:color w:val="5A6154"/>
+        <w:sz w:val="16"/>
+      </w:rPr>
+      <w:t>Working draft. Not legal advice. Payment authorisation stays human.</w:t>
+    </w:r>
+  </w:p>
+</w:ftr>
+</file>
+
+<file path=word/header1.xml><?xml version="1.0" encoding="utf-8"?>
+<w:hdr xmlns:m="http://schemas.openxmlformats.org/officeDocument/2006/math" xmlns:mc="http://schemas.openxmlformats.org/markup-compatibility/2006" xmlns:mo="http://schemas.microsoft.com/office/mac/office/2008/main" xmlns:mv="urn:schemas-microsoft-com:mac:vml" xmlns:o="urn:schemas-microsoft-com:office:office" xmlns:r="http://schemas.openxmlformats.org/officeDocument/2006/relationships" xmlns:v="urn:schemas-microsoft-com:vml" xmlns:w10="urn:schemas-microsoft-com:office:word" xmlns:w14="http://schemas.microsoft.com/office/word/2010/wordml" xmlns:w="http://schemas.openxmlformats.org/wordprocessingml/2006/main" xmlns:wne="http://schemas.microsoft.com/office/word/2006/wordml" xmlns:wp14="http://schemas.microsoft.com/office/word/2010/wordprocessingDrawing" xmlns:wp="http://schemas.openxmlformats.org/drawingml/2006/wordprocessingDrawing" xmlns:wpc="http://schemas.microsoft.com/office/word/2010/wordprocessingCanvas" xmlns:wpg="http://schemas.microsoft.com/office/word/2010/wordprocessingGroup" xmlns:wpi="http://schemas.microsoft.com/office/word/2010/wordprocessingInk" xmlns:wps="http://schemas.microsoft.com/office/word/2010/wordprocessingShape" mc:Ignorable="w14 wp14">
+  <w:p>
+    <w:pPr>
+      <w:pStyle w:val="Header"/>
+    </w:pPr>
+    <w:r>
+      <w:rPr>
+        <w:rFonts w:ascii="Calibri" w:hAnsi="Calibri" w:eastAsia="Calibri"/>
+        <w:b w:val="0"/>
+        <w:color w:val="B0893E"/>
+        <w:sz w:val="16"/>
+      </w:rPr>
+      <w:t>EVIDENCE ROOM — AP AGENT OS  ·  Proof before permission.</w:t>
+    </w:r>
+  </w:p>
+</w:hdr>
 </file>
 
 <file path=word/numbering.xml><?xml version="1.0" encoding="utf-8"?>
@@ -395,9 +1902,6 @@
     <w:name w:val="Normal"/>
     <w:qFormat/>
     <w:rsid w:val="00FC693F"/>
-    <w:rPr>
-      <w:rFonts w:ascii="Calibri" w:hAnsi="Calibri"/>
-    </w:rPr>
   </w:style>
   <w:style w:type="paragraph" w:styleId="Header">
     <w:name w:val="header"/>

</xml_diff>